<commit_message>
Update resume copy and PDF layout
</commit_message>
<xml_diff>
--- a/docs/Antonio_Colomba_Fast_Resume.docx
+++ b/docs/Antonio_Colomba_Fast_Resume.docx
@@ -204,7 +204,7 @@
           <w:color w:val="5B6673"/>
           <w:sz w:val="17"/>
         </w:rPr>
-        <w:t xml:space="preserve">   NYC | dates to confirm</w:t>
+        <w:t xml:space="preserve">   NYC</w:t>
       </w:r>
     </w:p>
     <w:p>
@@ -385,16 +385,6 @@
         </w:rPr>
         <w:t>Agentic Engineered Technical Projects</w:t>
       </w:r>
-      <w:r>
-        <w:rPr>
-          <w:rFonts w:ascii="Aptos" w:hAnsi="Aptos" w:eastAsia="Aptos"/>
-          <w:b w:val="0"/>
-          <w:i w:val="0"/>
-          <w:color w:val="5B6673"/>
-          <w:sz w:val="17"/>
-        </w:rPr>
-        <w:t xml:space="preserve">   local/private</w:t>
-      </w:r>
     </w:p>
     <w:p>
       <w:pPr>
@@ -410,7 +400,7 @@
           <w:color w:val="1F2933"/>
           <w:sz w:val="18"/>
         </w:rPr>
-        <w:t>Built and organized a multi-blockchain token creation platform, decentralized DeFi trading platform on Solana and EVM networks, AI content creation platform, and mind-bending audio attitude training app.</w:t>
+        <w:t>Engineered a multi-blockchain token creation platform, decentralized DeFi trading platform on Solana and EVM networks, AI content creation platform, and mind-bending audio attitude training app.</w:t>
       </w:r>
     </w:p>
     <w:p>
@@ -469,7 +459,7 @@
           <w:color w:val="1F2933"/>
           <w:sz w:val="18"/>
         </w:rPr>
-        <w:t>Available for support, operations, admin, production help, customer success, technical support, data entry, inventory support, and temp assignments. Open to in-person, hybrid, remote, temporary, contract, part-time, or full-time work.</w:t>
+        <w:t>Available for operations, admin, production coordination, customer success, technical support, and temp assignments. Open to in-person, hybrid, remote, temporary, contract, part-time, or full-time work.</w:t>
       </w:r>
     </w:p>
     <w:p>

</xml_diff>

<commit_message>
Add website to resume headers
</commit_message>
<xml_diff>
--- a/docs/Antonio_Colomba_Fast_Resume.docx
+++ b/docs/Antonio_Colomba_Fast_Resume.docx
@@ -32,6 +32,19 @@
           <w:sz w:val="18"/>
         </w:rPr>
         <w:t>NYC / Remote  |  (561) 271-1163  |  getantonio@gmail.com</w:t>
+      </w:r>
+      <w:r>
+        <w:br/>
+      </w:r>
+      <w:r>
+        <w:rPr>
+          <w:rFonts w:ascii="Aptos" w:hAnsi="Aptos" w:eastAsia="Aptos"/>
+          <w:b w:val="0"/>
+          <w:i w:val="0"/>
+          <w:color w:val="5B6673"/>
+          <w:sz w:val="18"/>
+        </w:rPr>
+        <w:t>www.acolomba.com</w:t>
       </w:r>
     </w:p>
     <w:p>

</xml_diff>